<commit_message>
Preparing for Stripe API
</commit_message>
<xml_diff>
--- a/Documentation/План розробки.docx
+++ b/Documentation/План розробки.docx
@@ -50,9 +50,19 @@
           <w:rFonts w:ascii="Times New Roman" w:hAnsi="Times New Roman" w:cs="Times New Roman"/>
           <w:sz w:val="24"/>
           <w:szCs w:val="24"/>
+          <w:highlight w:val="green"/>
           <w:u w:val="single"/>
         </w:rPr>
-        <w:t>Етап 0: Підготовка та вирівнювання</w:t>
+        <w:t>Етап 0</w:t>
+      </w:r>
+      <w:r>
+        <w:rPr>
+          <w:rFonts w:ascii="Times New Roman" w:hAnsi="Times New Roman" w:cs="Times New Roman"/>
+          <w:sz w:val="24"/>
+          <w:szCs w:val="24"/>
+          <w:u w:val="single"/>
+        </w:rPr>
+        <w:t>: Підготовка та вирівнювання</w:t>
       </w:r>
     </w:p>
     <w:p>

</xml_diff>

<commit_message>
Nova Poshta API add
</commit_message>
<xml_diff>
--- a/Documentation/План розробки.docx
+++ b/Documentation/План розробки.docx
@@ -419,9 +419,19 @@
           <w:rFonts w:ascii="Times New Roman" w:hAnsi="Times New Roman" w:cs="Times New Roman"/>
           <w:sz w:val="24"/>
           <w:szCs w:val="24"/>
+          <w:highlight w:val="green"/>
           <w:u w:val="single"/>
         </w:rPr>
-        <w:t>Етап 2: Доставка Nova Poshta</w:t>
+        <w:t>Етап 2</w:t>
+      </w:r>
+      <w:r>
+        <w:rPr>
+          <w:rFonts w:ascii="Times New Roman" w:hAnsi="Times New Roman" w:cs="Times New Roman"/>
+          <w:sz w:val="24"/>
+          <w:szCs w:val="24"/>
+          <w:u w:val="single"/>
+        </w:rPr>
+        <w:t>: Доставка Nova Poshta</w:t>
       </w:r>
     </w:p>
     <w:p>

</xml_diff>

<commit_message>
Implementation of the order and transaction lifecycle
</commit_message>
<xml_diff>
--- a/Documentation/План розробки.docx
+++ b/Documentation/План розробки.docx
@@ -574,9 +574,19 @@
           <w:rFonts w:ascii="Times New Roman" w:hAnsi="Times New Roman" w:cs="Times New Roman"/>
           <w:sz w:val="24"/>
           <w:szCs w:val="24"/>
+          <w:highlight w:val="green"/>
           <w:u w:val="single"/>
         </w:rPr>
-        <w:t>Етап 3: Життєвий цикл замовлення і транзакції</w:t>
+        <w:t>Етап 3</w:t>
+      </w:r>
+      <w:r>
+        <w:rPr>
+          <w:rFonts w:ascii="Times New Roman" w:hAnsi="Times New Roman" w:cs="Times New Roman"/>
+          <w:sz w:val="24"/>
+          <w:szCs w:val="24"/>
+          <w:u w:val="single"/>
+        </w:rPr>
+        <w:t>: Життєвий цикл замовлення і транзакції</w:t>
       </w:r>
     </w:p>
     <w:p>

</xml_diff>

<commit_message>
Implementation of inventory management
</commit_message>
<xml_diff>
--- a/Documentation/План розробки.docx
+++ b/Documentation/План розробки.docx
@@ -730,9 +730,19 @@
           <w:rFonts w:ascii="Times New Roman" w:hAnsi="Times New Roman" w:cs="Times New Roman"/>
           <w:sz w:val="24"/>
           <w:szCs w:val="24"/>
+          <w:highlight w:val="green"/>
           <w:u w:val="single"/>
         </w:rPr>
-        <w:t>Етап 4: Складський облік</w:t>
+        <w:t>Етап 4</w:t>
+      </w:r>
+      <w:r>
+        <w:rPr>
+          <w:rFonts w:ascii="Times New Roman" w:hAnsi="Times New Roman" w:cs="Times New Roman"/>
+          <w:sz w:val="24"/>
+          <w:szCs w:val="24"/>
+          <w:u w:val="single"/>
+        </w:rPr>
+        <w:t>: Складський облік</w:t>
       </w:r>
     </w:p>
     <w:p>

</xml_diff>

<commit_message>
Deepening discount and promo code logic
</commit_message>
<xml_diff>
--- a/Documentation/План розробки.docx
+++ b/Documentation/План розробки.docx
@@ -849,9 +849,19 @@
           <w:rFonts w:ascii="Times New Roman" w:hAnsi="Times New Roman" w:cs="Times New Roman"/>
           <w:sz w:val="24"/>
           <w:szCs w:val="24"/>
+          <w:highlight w:val="green"/>
           <w:u w:val="single"/>
         </w:rPr>
-        <w:t>Етап 5: Знижки і промокоди</w:t>
+        <w:t>Етап 5</w:t>
+      </w:r>
+      <w:r>
+        <w:rPr>
+          <w:rFonts w:ascii="Times New Roman" w:hAnsi="Times New Roman" w:cs="Times New Roman"/>
+          <w:sz w:val="24"/>
+          <w:szCs w:val="24"/>
+          <w:u w:val="single"/>
+        </w:rPr>
+        <w:t>: Знижки і промокоди</w:t>
       </w:r>
     </w:p>
     <w:p>

</xml_diff>

<commit_message>
Tools for managing products and images
</commit_message>
<xml_diff>
--- a/Documentation/План розробки.docx
+++ b/Documentation/План розробки.docx
@@ -1911,9 +1911,19 @@
           <w:rFonts w:ascii="Times New Roman" w:hAnsi="Times New Roman" w:cs="Times New Roman"/>
           <w:sz w:val="24"/>
           <w:szCs w:val="24"/>
+          <w:highlight w:val="green"/>
           <w:u w:val="single"/>
         </w:rPr>
-        <w:t>Етап 8: Каталог і медіа</w:t>
+        <w:t>Етап 8</w:t>
+      </w:r>
+      <w:r>
+        <w:rPr>
+          <w:rFonts w:ascii="Times New Roman" w:hAnsi="Times New Roman" w:cs="Times New Roman"/>
+          <w:sz w:val="24"/>
+          <w:szCs w:val="24"/>
+          <w:u w:val="single"/>
+        </w:rPr>
+        <w:t>: Каталог і медіа</w:t>
       </w:r>
     </w:p>
     <w:p>

</xml_diff>

<commit_message>
Enhancing the user profile page
</commit_message>
<xml_diff>
--- a/Documentation/План розробки.docx
+++ b/Documentation/План розробки.docx
@@ -2030,9 +2030,19 @@
           <w:rFonts w:ascii="Times New Roman" w:hAnsi="Times New Roman" w:cs="Times New Roman"/>
           <w:sz w:val="24"/>
           <w:szCs w:val="24"/>
+          <w:highlight w:val="green"/>
           <w:u w:val="single"/>
         </w:rPr>
-        <w:t>Етап 9: Особистий кабінет користувача</w:t>
+        <w:t>Етап 9</w:t>
+      </w:r>
+      <w:r>
+        <w:rPr>
+          <w:rFonts w:ascii="Times New Roman" w:hAnsi="Times New Roman" w:cs="Times New Roman"/>
+          <w:sz w:val="24"/>
+          <w:szCs w:val="24"/>
+          <w:u w:val="single"/>
+        </w:rPr>
+        <w:t>: Особистий кабінет користувача</w:t>
       </w:r>
     </w:p>
     <w:p>

</xml_diff>

<commit_message>
Enhancing the admin panel
</commit_message>
<xml_diff>
--- a/Documentation/План розробки.docx
+++ b/Documentation/План розробки.docx
@@ -2167,9 +2167,19 @@
           <w:rFonts w:ascii="Times New Roman" w:hAnsi="Times New Roman" w:cs="Times New Roman"/>
           <w:sz w:val="24"/>
           <w:szCs w:val="24"/>
+          <w:highlight w:val="green"/>
           <w:u w:val="single"/>
         </w:rPr>
-        <w:t>Етап 10: Адмін-панель</w:t>
+        <w:t>Етап 10</w:t>
+      </w:r>
+      <w:r>
+        <w:rPr>
+          <w:rFonts w:ascii="Times New Roman" w:hAnsi="Times New Roman" w:cs="Times New Roman"/>
+          <w:sz w:val="24"/>
+          <w:szCs w:val="24"/>
+          <w:u w:val="single"/>
+        </w:rPr>
+        <w:t>: Адмін-панель</w:t>
       </w:r>
     </w:p>
     <w:p>

</xml_diff>

<commit_message>
Enhancing analytics and reporting mechanisms
</commit_message>
<xml_diff>
--- a/Documentation/План розробки.docx
+++ b/Documentation/План розробки.docx
@@ -2322,9 +2322,19 @@
           <w:rFonts w:ascii="Times New Roman" w:hAnsi="Times New Roman" w:cs="Times New Roman"/>
           <w:sz w:val="24"/>
           <w:szCs w:val="24"/>
+          <w:highlight w:val="green"/>
           <w:u w:val="single"/>
         </w:rPr>
-        <w:t>Етап 11: Аналітика і звітність</w:t>
+        <w:t>Етап 11</w:t>
+      </w:r>
+      <w:r>
+        <w:rPr>
+          <w:rFonts w:ascii="Times New Roman" w:hAnsi="Times New Roman" w:cs="Times New Roman"/>
+          <w:sz w:val="24"/>
+          <w:szCs w:val="24"/>
+          <w:u w:val="single"/>
+        </w:rPr>
+        <w:t>: Аналітика і звітність</w:t>
       </w:r>
     </w:p>
     <w:p>

</xml_diff>

<commit_message>
Enhance security, validation, and error handling
</commit_message>
<xml_diff>
--- a/Documentation/План розробки.docx
+++ b/Documentation/План розробки.docx
@@ -2423,9 +2423,19 @@
           <w:rFonts w:ascii="Times New Roman" w:hAnsi="Times New Roman" w:cs="Times New Roman"/>
           <w:sz w:val="24"/>
           <w:szCs w:val="24"/>
+          <w:highlight w:val="green"/>
           <w:u w:val="single"/>
         </w:rPr>
-        <w:t>Етап 12: Безпека та NFR</w:t>
+        <w:t>Етап 12</w:t>
+      </w:r>
+      <w:r>
+        <w:rPr>
+          <w:rFonts w:ascii="Times New Roman" w:hAnsi="Times New Roman" w:cs="Times New Roman"/>
+          <w:sz w:val="24"/>
+          <w:szCs w:val="24"/>
+          <w:u w:val="single"/>
+        </w:rPr>
+        <w:t>: Безпека та NFR</w:t>
       </w:r>
     </w:p>
     <w:p>

</xml_diff>

<commit_message>
Preparing localization and UX improvements
</commit_message>
<xml_diff>
--- a/Documentation/План розробки.docx
+++ b/Documentation/План розробки.docx
@@ -2829,9 +2829,19 @@
           <w:rFonts w:ascii="Times New Roman" w:hAnsi="Times New Roman" w:cs="Times New Roman"/>
           <w:sz w:val="24"/>
           <w:szCs w:val="24"/>
+          <w:highlight w:val="green"/>
           <w:u w:val="single"/>
         </w:rPr>
-        <w:t>Етап 13: Локалізація та UX</w:t>
+        <w:t>Етап 13</w:t>
+      </w:r>
+      <w:r>
+        <w:rPr>
+          <w:rFonts w:ascii="Times New Roman" w:hAnsi="Times New Roman" w:cs="Times New Roman"/>
+          <w:sz w:val="24"/>
+          <w:szCs w:val="24"/>
+          <w:u w:val="single"/>
+        </w:rPr>
+        <w:t>: Локалізація та UX</w:t>
       </w:r>
     </w:p>
     <w:p>

</xml_diff>

<commit_message>
Add auto-migrations and update CORS for Render
</commit_message>
<xml_diff>
--- a/Documentation/План розробки.docx
+++ b/Documentation/План розробки.docx
@@ -2912,9 +2912,19 @@
           <w:rFonts w:ascii="Times New Roman" w:hAnsi="Times New Roman" w:cs="Times New Roman"/>
           <w:sz w:val="24"/>
           <w:szCs w:val="24"/>
+          <w:highlight w:val="green"/>
           <w:u w:val="single"/>
         </w:rPr>
-        <w:t>Етап 14: DevOps і Реліз</w:t>
+        <w:t>Етап 14</w:t>
+      </w:r>
+      <w:r>
+        <w:rPr>
+          <w:rFonts w:ascii="Times New Roman" w:hAnsi="Times New Roman" w:cs="Times New Roman"/>
+          <w:sz w:val="24"/>
+          <w:szCs w:val="24"/>
+          <w:u w:val="single"/>
+        </w:rPr>
+        <w:t>: DevOps і Реліз</w:t>
       </w:r>
     </w:p>
     <w:p>

</xml_diff>